<commit_message>
feat(ai): optimize AI chatbot architecture and streaming performance for shared hosting
</commit_message>
<xml_diff>
--- a/laporan/03_Laporan_Mingguan_Latsar/M3 - Laporan Mingguan Pelaksanaan Aktualisasi Pelatihan Dasar CPNS BPS Tahun 2026.docx
+++ b/laporan/03_Laporan_Mingguan_Latsar/M3 - Laporan Mingguan Pelaksanaan Aktualisasi Pelatihan Dasar CPNS BPS Tahun 2026.docx
@@ -1230,13 +1230,24 @@
                 <w:szCs w:val="20"/>
               </w:rPr>
             </w:pPr>
-            <w:r>
-              <w:rPr>
-                <w:rFonts w:ascii="Calibri" w:hAnsi="Calibri" w:cs="Calibri"/>
-                <w:sz w:val="20"/>
-                <w:szCs w:val="20"/>
-              </w:rPr>
-              <w:t>https://drive.google.com/drive/folders/1HBzMXTEGDXtoOsl5g19x-OxMywhlZj6I?usp=sharing</w:t>
+            <w:hyperlink r:id="rId7" w:history="1">
+              <w:r>
+                <w:rPr>
+                  <w:rStyle w:val="Hyperlink"/>
+                  <w:rFonts w:ascii="Calibri" w:hAnsi="Calibri" w:cs="Calibri"/>
+                  <w:sz w:val="20"/>
+                  <w:szCs w:val="20"/>
+                </w:rPr>
+                <w:t>https://drive.google.com/drive/folders/1UpnqKrWOLYXqeEhK7yJZHGvU21H4ISZs?usp=drive_link</w:t>
+              </w:r>
+            </w:hyperlink>
+            <w:r>
+              <w:rPr>
+                <w:rFonts w:ascii="Calibri" w:hAnsi="Calibri" w:cs="Calibri"/>
+                <w:sz w:val="20"/>
+                <w:szCs w:val="20"/>
+              </w:rPr>
+              <w:t xml:space="preserve"> </w:t>
             </w:r>
           </w:p>
         </w:tc>
@@ -1568,7 +1579,7 @@
                           </pic:cNvPicPr>
                         </pic:nvPicPr>
                         <pic:blipFill>
-                          <a:blip r:embed="rId7" cstate="print">
+                          <a:blip r:embed="rId8" cstate="print">
                             <a:extLst>
                               <a:ext uri="{28A0092B-C50C-407E-A947-70E740481C1C}">
                                 <a14:useLocalDpi xmlns:a14="http://schemas.microsoft.com/office/drawing/2010/main" val="0"/>
@@ -1665,6 +1676,28 @@
                 <w:lang w:val="en-US"/>
               </w:rPr>
             </w:pPr>
+            <w:hyperlink r:id="rId9" w:history="1">
+              <w:r>
+                <w:rPr>
+                  <w:rStyle w:val="Hyperlink"/>
+                  <w:rFonts w:ascii="Calibri" w:hAnsi="Calibri" w:cs="Calibri"/>
+                  <w:sz w:val="20"/>
+                  <w:szCs w:val="20"/>
+                  <w:lang w:val="en-US"/>
+                </w:rPr>
+                <w:t>https://drive.google.com/drive/folders/1mSniiqHHQch2QerrcgUjLhDIDew-rHq5?usp=drive_link</w:t>
+              </w:r>
+            </w:hyperlink>
+            <w:r>
+              <w:rPr>
+                <w:rFonts w:ascii="Calibri" w:hAnsi="Calibri" w:cs="Calibri"/>
+                <w:color w:val="0F9ED5" w:themeColor="accent4"/>
+                <w:sz w:val="20"/>
+                <w:szCs w:val="20"/>
+                <w:lang w:val="en-US"/>
+              </w:rPr>
+              <w:t xml:space="preserve"> </w:t>
+            </w:r>
           </w:p>
         </w:tc>
       </w:tr>
@@ -1816,7 +1849,7 @@
                           </pic:cNvPicPr>
                         </pic:nvPicPr>
                         <pic:blipFill>
-                          <a:blip r:embed="rId8" cstate="print">
+                          <a:blip r:embed="rId10" cstate="print">
                             <a:extLst>
                               <a:ext uri="{28A0092B-C50C-407E-A947-70E740481C1C}">
                                 <a14:useLocalDpi xmlns:a14="http://schemas.microsoft.com/office/drawing/2010/main" val="0"/>
@@ -1935,6 +1968,28 @@
                 <w:lang w:val="en-US"/>
               </w:rPr>
             </w:pPr>
+            <w:hyperlink r:id="rId11" w:history="1">
+              <w:r>
+                <w:rPr>
+                  <w:rStyle w:val="Hyperlink"/>
+                  <w:rFonts w:ascii="Calibri" w:hAnsi="Calibri" w:cs="Calibri"/>
+                  <w:sz w:val="20"/>
+                  <w:szCs w:val="20"/>
+                  <w:lang w:val="en-US"/>
+                </w:rPr>
+                <w:t>https://drive.google.com/drive/folders/17_g0BYt5SCbOfhRWIhcFjvXFxvKW85ix?usp=drive_link</w:t>
+              </w:r>
+            </w:hyperlink>
+            <w:r>
+              <w:rPr>
+                <w:rFonts w:ascii="Calibri" w:hAnsi="Calibri" w:cs="Calibri"/>
+                <w:color w:val="000000" w:themeColor="text1"/>
+                <w:sz w:val="20"/>
+                <w:szCs w:val="20"/>
+                <w:lang w:val="en-US"/>
+              </w:rPr>
+              <w:t xml:space="preserve"> </w:t>
+            </w:r>
           </w:p>
         </w:tc>
       </w:tr>
@@ -2110,7 +2165,7 @@
                           </pic:cNvPicPr>
                         </pic:nvPicPr>
                         <pic:blipFill>
-                          <a:blip r:embed="rId9" cstate="print">
+                          <a:blip r:embed="rId12" cstate="print">
                             <a:extLst>
                               <a:ext uri="{28A0092B-C50C-407E-A947-70E740481C1C}">
                                 <a14:useLocalDpi xmlns:a14="http://schemas.microsoft.com/office/drawing/2010/main" val="0"/>
@@ -2222,6 +2277,35 @@
                 <w:szCs w:val="20"/>
               </w:rPr>
             </w:pPr>
+            <w:hyperlink r:id="rId13" w:history="1">
+              <w:r>
+                <w:rPr>
+                  <w:rStyle w:val="Hyperlink"/>
+                  <w:rFonts w:ascii="Calibri" w:hAnsi="Calibri" w:cs="Calibri"/>
+                  <w:sz w:val="20"/>
+                  <w:szCs w:val="20"/>
+                </w:rPr>
+                <w:t>https://drive.google.com/drive/folders/1_x-</w:t>
+              </w:r>
+              <w:r>
+                <w:rPr>
+                  <w:rStyle w:val="Hyperlink"/>
+                  <w:rFonts w:ascii="Calibri" w:hAnsi="Calibri" w:cs="Calibri"/>
+                  <w:sz w:val="20"/>
+                  <w:szCs w:val="20"/>
+                </w:rPr>
+                <w:lastRenderedPageBreak/>
+                <w:t>u98CID6zbJdkSBeTbjnyG4ddqq3Zi?usp=drive_link</w:t>
+              </w:r>
+            </w:hyperlink>
+            <w:r>
+              <w:rPr>
+                <w:rFonts w:ascii="Calibri" w:hAnsi="Calibri" w:cs="Calibri"/>
+                <w:sz w:val="20"/>
+                <w:szCs w:val="20"/>
+              </w:rPr>
+              <w:t xml:space="preserve"> </w:t>
+            </w:r>
           </w:p>
         </w:tc>
       </w:tr>
@@ -3022,7 +3106,7 @@
                           </pic:cNvPicPr>
                         </pic:nvPicPr>
                         <pic:blipFill rotWithShape="1">
-                          <a:blip r:embed="rId10">
+                          <a:blip r:embed="rId14">
                             <a:extLst>
                               <a:ext uri="{28A0092B-C50C-407E-A947-70E740481C1C}">
                                 <a14:useLocalDpi xmlns:a14="http://schemas.microsoft.com/office/drawing/2010/main" val="0"/>

</xml_diff>